<commit_message>
laporan harian: lampiran and aktivitas
</commit_message>
<xml_diff>
--- a/storage/app/templates/laporan-harian/template-laporan-harian.docx
+++ b/storage/app/templates/laporan-harian/template-laporan-harian.docx
@@ -1863,6 +1863,21 @@
     </w:p>
     <w:p>
       <w:pPr>
+        <w:spacing w:after="0" w:line="240" w:lineRule="auto"/>
+        <w:jc w:val="left"/>
+        <w:rPr>
+          <w:rFonts w:ascii="Times New Roman" w:hAnsi="Times New Roman" w:cs="Times New Roman"/>
+        </w:rPr>
+      </w:pPr>
+      <w:r>
+        <w:rPr>
+          <w:rFonts w:ascii="Times New Roman" w:hAnsi="Times New Roman" w:cs="Times New Roman"/>
+        </w:rPr>
+        <w:t xml:space="preserve">${blok_kategori}</w:t>
+      </w:r>
+    </w:p>
+    <w:p>
+      <w:pPr>
         <w:pStyle w:val="ListParagraph"/>
         <w:numPr>
           <w:ilvl w:val="0"/>
@@ -1880,7 +1895,7 @@
           <w:rFonts w:ascii="Times New Roman" w:hAnsi="Times New Roman"/>
           <w:b/>
         </w:rPr>
-        <w:t>New Building</w:t>
+        <w:t>${aktivitas_kategori}</w:t>
       </w:r>
     </w:p>
     <w:tbl>
@@ -2124,6 +2139,30 @@
         </w:tc>
       </w:tr>
     </w:tbl>
+    <w:p>
+      <w:pPr>
+        <w:spacing w:after="120" w:line="240" w:lineRule="auto"/>
+        <w:jc w:val="left"/>
+        <w:rPr>
+          <w:rFonts w:ascii="Times New Roman" w:hAnsi="Times New Roman" w:cs="Times New Roman"/>
+        </w:rPr>
+      </w:pPr>
+    </w:p>
+    <w:p>
+      <w:pPr>
+        <w:spacing w:after="0" w:line="240" w:lineRule="auto"/>
+        <w:jc w:val="left"/>
+        <w:rPr>
+          <w:rFonts w:ascii="Times New Roman" w:hAnsi="Times New Roman" w:cs="Times New Roman"/>
+        </w:rPr>
+      </w:pPr>
+      <w:r>
+        <w:rPr>
+          <w:rFonts w:ascii="Times New Roman" w:hAnsi="Times New Roman" w:cs="Times New Roman"/>
+        </w:rPr>
+        <w:t xml:space="preserve">${/blok_kategori}</w:t>
+      </w:r>
+    </w:p>
     <w:tbl>
       <w:tblPr>
         <w:tblStyle w:val="LightGrid-Accent3"/>
@@ -2794,211 +2833,420 @@
         </w:rPr>
       </w:pPr>
     </w:p>
+    <w:p>
+      <w:pPr>
+        <w:spacing w:after="0" w:line="240" w:lineRule="auto"/>
+        <w:jc w:val="left"/>
+        <w:rPr>
+          <w:rFonts w:ascii="Times New Roman" w:hAnsi="Times New Roman" w:cs="Times New Roman"/>
+        </w:rPr>
+      </w:pPr>
+      <w:r>
+        <w:rPr>
+          <w:rFonts w:ascii="Times New Roman" w:hAnsi="Times New Roman" w:cs="Times New Roman"/>
+        </w:rPr>
+        <w:t xml:space="preserve">${lampiran_kosong}</w:t>
+      </w:r>
+    </w:p>
+    <w:p>
+      <w:pPr>
+        <w:spacing w:after="0" w:line="240" w:lineRule="auto"/>
+        <w:jc w:val="left"/>
+        <w:rPr>
+          <w:rFonts w:ascii="Times New Roman" w:hAnsi="Times New Roman" w:cs="Times New Roman"/>
+        </w:rPr>
+      </w:pPr>
+      <w:r>
+        <w:rPr>
+          <w:rFonts w:ascii="Times New Roman" w:hAnsi="Times New Roman" w:cs="Times New Roman"/>
+        </w:rPr>
+        <w:t xml:space="preserve">${blok_lampiran}</w:t>
+      </w:r>
+    </w:p>
+    <w:p>
+      <w:pPr>
+        <w:spacing w:after="0" w:line="240" w:lineRule="auto"/>
+        <w:jc w:val="left"/>
+        <w:rPr>
+          <w:rFonts w:ascii="Times New Roman" w:hAnsi="Times New Roman" w:cs="Times New Roman"/>
+        </w:rPr>
+      </w:pPr>
+      <w:r>
+        <w:rPr>
+          <w:rFonts w:ascii="Times New Roman" w:hAnsi="Times New Roman" w:cs="Times New Roman"/>
+        </w:rPr>
+        <w:t xml:space="preserve">${lampiran_pemisah}</w:t>
+      </w:r>
+    </w:p>
     <w:tbl>
       <w:tblPr>
-        <w:tblStyle w:val="TableGrid"/>
-        <w:tblW w:w="9498" w:type="dxa"/>
+        <w:tblW w:w="5000" w:type="pct"/>
         <w:jc w:val="center"/>
-        <w:tblLook w:val="04A0" w:firstRow="1" w:lastRow="0" w:firstColumn="1" w:lastColumn="0" w:noHBand="0" w:noVBand="1"/>
+        <w:tblBorders>
+          <w:top w:val="single" w:sz="4" w:space="0" w:color="auto"/>
+          <w:left w:val="single" w:sz="4" w:space="0" w:color="auto"/>
+          <w:bottom w:val="single" w:sz="4" w:space="0" w:color="auto"/>
+          <w:right w:val="single" w:sz="4" w:space="0" w:color="auto"/>
+          <w:insideH w:val="single" w:sz="4" w:space="0" w:color="auto"/>
+          <w:insideV w:val="single" w:sz="4" w:space="0" w:color="auto"/>
+        </w:tblBorders>
+        <w:tblLayout w:type="fixed"/>
+        <w:tblCellMar>
+          <w:left w:w="80" w:type="dxa"/>
+          <w:right w:w="80" w:type="dxa"/>
+        </w:tblCellMar>
+        <w:tblLook w:val="0000" w:firstRow="0" w:lastRow="0" w:firstColumn="0" w:lastColumn="0" w:noHBand="1" w:noVBand="1"/>
       </w:tblPr>
       <w:tblGrid>
-        <w:gridCol w:w="1519"/>
-        <w:gridCol w:w="4014"/>
-        <w:gridCol w:w="3965"/>
+        <w:gridCol w:w="4513"/>
+        <w:gridCol w:w="4513"/>
       </w:tblGrid>
       <w:tr>
         <w:trPr>
-          <w:jc w:val="center"/>
+          <w:cantSplit/>
         </w:trPr>
         <w:tc>
           <w:tcPr>
-            <w:tcW w:w="917" w:type="dxa"/>
+            <w:tcW w:w="4513" w:type="dxa"/>
+            <w:shd w:val="clear" w:color="auto" w:fill="DEEAF6"/>
             <w:vAlign w:val="center"/>
           </w:tcPr>
           <w:p>
             <w:pPr>
-              <w:tabs>
-                <w:tab w:val="left" w:pos="942"/>
-              </w:tabs>
+              <w:spacing w:before="60" w:after="60" w:line="240" w:lineRule="auto"/>
               <w:jc w:val="center"/>
               <w:rPr>
                 <w:rFonts w:ascii="Times New Roman" w:hAnsi="Times New Roman" w:cs="Times New Roman"/>
-              </w:rPr>
-            </w:pPr>
-            <w:r>
-              <w:rPr>
-                <w:rFonts w:ascii="Times New Roman" w:hAnsi="Times New Roman"/>
-              </w:rPr>
-              <w:t>No</w:t>
-            </w:r>
-          </w:p>
-        </w:tc>
-        <w:tc>
-          <w:tcPr>
-            <w:tcW w:w="4290" w:type="dxa"/>
+                <w:b/>
+                <w:bCs/>
+                <w:sz w:val="20"/>
+              </w:rPr>
+            </w:pPr>
+            <w:r>
+              <w:rPr>
+                <w:rFonts w:ascii="Times New Roman" w:hAnsi="Times New Roman" w:cs="Times New Roman"/>
+                <w:b/>
+                <w:bCs/>
+                <w:sz w:val="20"/>
+              </w:rPr>
+              <w:t xml:space="preserve">${lp_kategori_1}</w:t>
+            </w:r>
+          </w:p>
+        </w:tc>
+        <w:tc>
+          <w:tcPr>
+            <w:tcW w:w="4513" w:type="dxa"/>
+            <w:shd w:val="clear" w:color="auto" w:fill="DEEAF6"/>
             <w:vAlign w:val="center"/>
           </w:tcPr>
           <w:p>
             <w:pPr>
-              <w:tabs>
-                <w:tab w:val="left" w:pos="942"/>
-              </w:tabs>
+              <w:spacing w:before="60" w:after="60" w:line="240" w:lineRule="auto"/>
               <w:jc w:val="center"/>
               <w:rPr>
                 <w:rFonts w:ascii="Times New Roman" w:hAnsi="Times New Roman" w:cs="Times New Roman"/>
-              </w:rPr>
-            </w:pPr>
-            <w:r>
-              <w:rPr>
-                <w:rFonts w:ascii="Times New Roman" w:hAnsi="Times New Roman"/>
-              </w:rPr>
-              <w:t>Gambar</w:t>
-            </w:r>
-          </w:p>
-        </w:tc>
-        <w:tc>
-          <w:tcPr>
-            <w:tcW w:w="4291" w:type="dxa"/>
-            <w:vAlign w:val="center"/>
-          </w:tcPr>
-          <w:p>
-            <w:pPr>
-              <w:tabs>
-                <w:tab w:val="left" w:pos="942"/>
-              </w:tabs>
-              <w:jc w:val="center"/>
-              <w:rPr>
-                <w:rFonts w:ascii="Times New Roman" w:hAnsi="Times New Roman" w:cs="Times New Roman"/>
-              </w:rPr>
-            </w:pPr>
-            <w:proofErr w:type="spellStart"/>
-            <w:r>
-              <w:rPr>
-                <w:rFonts w:ascii="Times New Roman" w:hAnsi="Times New Roman" w:cs="Times New Roman"/>
-              </w:rPr>
-              <w:t>Keterangan</w:t>
-            </w:r>
-            <w:proofErr w:type="spellEnd"/>
+                <w:b/>
+                <w:bCs/>
+                <w:sz w:val="20"/>
+              </w:rPr>
+            </w:pPr>
+            <w:r>
+              <w:rPr>
+                <w:rFonts w:ascii="Times New Roman" w:hAnsi="Times New Roman" w:cs="Times New Roman"/>
+                <w:b/>
+                <w:bCs/>
+                <w:sz w:val="20"/>
+              </w:rPr>
+              <w:t xml:space="preserve">${lp_kategori_2}</w:t>
+            </w:r>
           </w:p>
         </w:tc>
       </w:tr>
       <w:tr>
         <w:trPr>
-          <w:trHeight w:val="703"/>
-          <w:jc w:val="center"/>
+          <w:cantSplit/>
+          <w:trHeight w:val="4250" w:hRule="exact"/>
         </w:trPr>
         <w:tc>
           <w:tcPr>
-            <w:tcW w:w="917" w:type="dxa"/>
-          </w:tcPr>
-          <w:p>
-            <w:pPr>
-              <w:tabs>
-                <w:tab w:val="left" w:pos="942"/>
-              </w:tabs>
-              <w:spacing w:before="120" w:after="120"/>
+            <w:tcW w:w="4513" w:type="dxa"/>
+            <w:vAlign w:val="center"/>
+          </w:tcPr>
+          <w:p>
+            <w:pPr>
+              <w:spacing w:before="60" w:after="60" w:line="240" w:lineRule="auto"/>
+              <w:jc w:val="center"/>
               <w:rPr>
                 <w:rFonts w:ascii="Times New Roman" w:hAnsi="Times New Roman" w:cs="Times New Roman"/>
                 <w:sz w:val="20"/>
-                <w:szCs w:val="20"/>
               </w:rPr>
             </w:pPr>
             <w:r>
               <w:rPr>
                 <w:rFonts w:ascii="Times New Roman" w:hAnsi="Times New Roman" w:cs="Times New Roman"/>
                 <w:sz w:val="20"/>
-                <w:szCs w:val="20"/>
-              </w:rPr>
-              <w:t>${</w:t>
-            </w:r>
-            <w:proofErr w:type="spellStart"/>
-            <w:r>
+              </w:rPr>
+              <w:t xml:space="preserve">${lp_gambar_1}</w:t>
+            </w:r>
+          </w:p>
+        </w:tc>
+        <w:tc>
+          <w:tcPr>
+            <w:tcW w:w="4513" w:type="dxa"/>
+            <w:vAlign w:val="center"/>
+          </w:tcPr>
+          <w:p>
+            <w:pPr>
+              <w:spacing w:before="60" w:after="60" w:line="240" w:lineRule="auto"/>
+              <w:jc w:val="center"/>
               <w:rPr>
                 <w:rFonts w:ascii="Times New Roman" w:hAnsi="Times New Roman" w:cs="Times New Roman"/>
                 <w:sz w:val="20"/>
-                <w:szCs w:val="20"/>
-              </w:rPr>
-              <w:t>lampiran_no</w:t>
-            </w:r>
-            <w:proofErr w:type="spellEnd"/>
+              </w:rPr>
+            </w:pPr>
             <w:r>
               <w:rPr>
                 <w:rFonts w:ascii="Times New Roman" w:hAnsi="Times New Roman" w:cs="Times New Roman"/>
                 <w:sz w:val="20"/>
-                <w:szCs w:val="20"/>
-              </w:rPr>
-              <w:t>}</w:t>
-            </w:r>
-          </w:p>
-        </w:tc>
-        <w:tc>
-          <w:tcPr>
-            <w:tcW w:w="4290" w:type="dxa"/>
-          </w:tcPr>
-          <w:p>
-            <w:pPr>
-              <w:tabs>
-                <w:tab w:val="left" w:pos="942"/>
-              </w:tabs>
-              <w:spacing w:before="120"/>
+              </w:rPr>
+              <w:t xml:space="preserve">${lp_gambar_2}</w:t>
+            </w:r>
+          </w:p>
+        </w:tc>
+      </w:tr>
+      <w:tr>
+        <w:trPr>
+          <w:cantSplit/>
+          <w:trHeight w:val="700" w:hRule="atLeast"/>
+        </w:trPr>
+        <w:tc>
+          <w:tcPr>
+            <w:tcW w:w="4513" w:type="dxa"/>
+            <w:vAlign w:val="top"/>
+          </w:tcPr>
+          <w:p>
+            <w:pPr>
+              <w:spacing w:before="60" w:after="60" w:line="240" w:lineRule="auto"/>
+              <w:jc w:val="both"/>
+              <w:rPr>
+                <w:rFonts w:ascii="Times New Roman" w:hAnsi="Times New Roman" w:cs="Times New Roman"/>
+                <w:sz w:val="20"/>
+              </w:rPr>
+            </w:pPr>
+            <w:r>
+              <w:rPr>
+                <w:rFonts w:ascii="Times New Roman" w:hAnsi="Times New Roman" w:cs="Times New Roman"/>
+                <w:sz w:val="20"/>
+              </w:rPr>
+              <w:t xml:space="preserve">${lp_uraian_1}</w:t>
+            </w:r>
+          </w:p>
+        </w:tc>
+        <w:tc>
+          <w:tcPr>
+            <w:tcW w:w="4513" w:type="dxa"/>
+            <w:vAlign w:val="top"/>
+          </w:tcPr>
+          <w:p>
+            <w:pPr>
+              <w:spacing w:before="60" w:after="60" w:line="240" w:lineRule="auto"/>
+              <w:jc w:val="both"/>
+              <w:rPr>
+                <w:rFonts w:ascii="Times New Roman" w:hAnsi="Times New Roman" w:cs="Times New Roman"/>
+                <w:sz w:val="20"/>
+              </w:rPr>
+            </w:pPr>
+            <w:r>
+              <w:rPr>
+                <w:rFonts w:ascii="Times New Roman" w:hAnsi="Times New Roman" w:cs="Times New Roman"/>
+                <w:sz w:val="20"/>
+              </w:rPr>
+              <w:t xml:space="preserve">${lp_uraian_2}</w:t>
+            </w:r>
+          </w:p>
+        </w:tc>
+      </w:tr>
+      <w:tr>
+        <w:trPr>
+          <w:cantSplit/>
+        </w:trPr>
+        <w:tc>
+          <w:tcPr>
+            <w:tcW w:w="4513" w:type="dxa"/>
+            <w:shd w:val="clear" w:color="auto" w:fill="DEEAF6"/>
+            <w:vAlign w:val="center"/>
+          </w:tcPr>
+          <w:p>
+            <w:pPr>
+              <w:spacing w:before="60" w:after="60" w:line="240" w:lineRule="auto"/>
               <w:jc w:val="center"/>
               <w:rPr>
-                <w:rFonts w:ascii="Times New Roman" w:hAnsi="Times New Roman"/>
-                <w:noProof/>
-                <w:lang w:val="en-US"/>
-                <w14:ligatures w14:val="standardContextual"/>
-              </w:rPr>
-            </w:pPr>
-            <w:r>
-              <w:rPr>
-                <w:rFonts w:ascii="Times New Roman" w:hAnsi="Times New Roman"/>
-                <w:noProof/>
-                <w:lang w:val="en-US"/>
-                <w14:ligatures w14:val="standardContextual"/>
-              </w:rPr>
-              <w:t>${lampiran_gambar}</w:t>
-            </w:r>
-          </w:p>
-        </w:tc>
-        <w:tc>
-          <w:tcPr>
-            <w:tcW w:w="4291" w:type="dxa"/>
-          </w:tcPr>
-          <w:p>
-            <w:pPr>
-              <w:tabs>
-                <w:tab w:val="left" w:pos="942"/>
-              </w:tabs>
-              <w:spacing w:before="120" w:after="120"/>
+                <w:rFonts w:ascii="Times New Roman" w:hAnsi="Times New Roman" w:cs="Times New Roman"/>
+                <w:b/>
+                <w:bCs/>
+                <w:sz w:val="20"/>
+              </w:rPr>
+            </w:pPr>
+            <w:r>
+              <w:rPr>
+                <w:rFonts w:ascii="Times New Roman" w:hAnsi="Times New Roman" w:cs="Times New Roman"/>
+                <w:b/>
+                <w:bCs/>
+                <w:sz w:val="20"/>
+              </w:rPr>
+              <w:t xml:space="preserve">${lp_kategori_3}</w:t>
+            </w:r>
+          </w:p>
+        </w:tc>
+        <w:tc>
+          <w:tcPr>
+            <w:tcW w:w="4513" w:type="dxa"/>
+            <w:shd w:val="clear" w:color="auto" w:fill="DEEAF6"/>
+            <w:vAlign w:val="center"/>
+          </w:tcPr>
+          <w:p>
+            <w:pPr>
+              <w:spacing w:before="60" w:after="60" w:line="240" w:lineRule="auto"/>
               <w:jc w:val="center"/>
               <w:rPr>
                 <w:rFonts w:ascii="Times New Roman" w:hAnsi="Times New Roman" w:cs="Times New Roman"/>
-              </w:rPr>
-            </w:pPr>
-            <w:r>
-              <w:rPr>
-                <w:rFonts w:ascii="Times New Roman" w:hAnsi="Times New Roman" w:cs="Times New Roman"/>
-              </w:rPr>
-              <w:t>${</w:t>
-            </w:r>
-            <w:proofErr w:type="spellStart"/>
-            <w:r>
-              <w:rPr>
-                <w:rFonts w:ascii="Times New Roman" w:hAnsi="Times New Roman" w:cs="Times New Roman"/>
-              </w:rPr>
-              <w:t>lampiran_ket</w:t>
-            </w:r>
-            <w:proofErr w:type="spellEnd"/>
-            <w:r>
-              <w:rPr>
-                <w:rFonts w:ascii="Times New Roman" w:hAnsi="Times New Roman" w:cs="Times New Roman"/>
-              </w:rPr>
-              <w:t>}</w:t>
+                <w:b/>
+                <w:bCs/>
+                <w:sz w:val="20"/>
+              </w:rPr>
+            </w:pPr>
+            <w:r>
+              <w:rPr>
+                <w:rFonts w:ascii="Times New Roman" w:hAnsi="Times New Roman" w:cs="Times New Roman"/>
+                <w:b/>
+                <w:bCs/>
+                <w:sz w:val="20"/>
+              </w:rPr>
+              <w:t xml:space="preserve">${lp_kategori_4}</w:t>
+            </w:r>
+          </w:p>
+        </w:tc>
+      </w:tr>
+      <w:tr>
+        <w:trPr>
+          <w:cantSplit/>
+          <w:trHeight w:val="4250" w:hRule="exact"/>
+        </w:trPr>
+        <w:tc>
+          <w:tcPr>
+            <w:tcW w:w="4513" w:type="dxa"/>
+            <w:vAlign w:val="center"/>
+          </w:tcPr>
+          <w:p>
+            <w:pPr>
+              <w:spacing w:before="60" w:after="60" w:line="240" w:lineRule="auto"/>
+              <w:jc w:val="center"/>
+              <w:rPr>
+                <w:rFonts w:ascii="Times New Roman" w:hAnsi="Times New Roman" w:cs="Times New Roman"/>
+                <w:sz w:val="20"/>
+              </w:rPr>
+            </w:pPr>
+            <w:r>
+              <w:rPr>
+                <w:rFonts w:ascii="Times New Roman" w:hAnsi="Times New Roman" w:cs="Times New Roman"/>
+                <w:sz w:val="20"/>
+              </w:rPr>
+              <w:t xml:space="preserve">${lp_gambar_3}</w:t>
+            </w:r>
+          </w:p>
+        </w:tc>
+        <w:tc>
+          <w:tcPr>
+            <w:tcW w:w="4513" w:type="dxa"/>
+            <w:vAlign w:val="center"/>
+          </w:tcPr>
+          <w:p>
+            <w:pPr>
+              <w:spacing w:before="60" w:after="60" w:line="240" w:lineRule="auto"/>
+              <w:jc w:val="center"/>
+              <w:rPr>
+                <w:rFonts w:ascii="Times New Roman" w:hAnsi="Times New Roman" w:cs="Times New Roman"/>
+                <w:sz w:val="20"/>
+              </w:rPr>
+            </w:pPr>
+            <w:r>
+              <w:rPr>
+                <w:rFonts w:ascii="Times New Roman" w:hAnsi="Times New Roman" w:cs="Times New Roman"/>
+                <w:sz w:val="20"/>
+              </w:rPr>
+              <w:t xml:space="preserve">${lp_gambar_4}</w:t>
+            </w:r>
+          </w:p>
+        </w:tc>
+      </w:tr>
+      <w:tr>
+        <w:trPr>
+          <w:cantSplit/>
+          <w:trHeight w:val="700" w:hRule="atLeast"/>
+        </w:trPr>
+        <w:tc>
+          <w:tcPr>
+            <w:tcW w:w="4513" w:type="dxa"/>
+            <w:vAlign w:val="top"/>
+          </w:tcPr>
+          <w:p>
+            <w:pPr>
+              <w:spacing w:before="60" w:after="60" w:line="240" w:lineRule="auto"/>
+              <w:jc w:val="both"/>
+              <w:rPr>
+                <w:rFonts w:ascii="Times New Roman" w:hAnsi="Times New Roman" w:cs="Times New Roman"/>
+                <w:sz w:val="20"/>
+              </w:rPr>
+            </w:pPr>
+            <w:r>
+              <w:rPr>
+                <w:rFonts w:ascii="Times New Roman" w:hAnsi="Times New Roman" w:cs="Times New Roman"/>
+                <w:sz w:val="20"/>
+              </w:rPr>
+              <w:t xml:space="preserve">${lp_uraian_3}</w:t>
+            </w:r>
+          </w:p>
+        </w:tc>
+        <w:tc>
+          <w:tcPr>
+            <w:tcW w:w="4513" w:type="dxa"/>
+            <w:vAlign w:val="top"/>
+          </w:tcPr>
+          <w:p>
+            <w:pPr>
+              <w:spacing w:before="60" w:after="60" w:line="240" w:lineRule="auto"/>
+              <w:jc w:val="both"/>
+              <w:rPr>
+                <w:rFonts w:ascii="Times New Roman" w:hAnsi="Times New Roman" w:cs="Times New Roman"/>
+                <w:sz w:val="20"/>
+              </w:rPr>
+            </w:pPr>
+            <w:r>
+              <w:rPr>
+                <w:rFonts w:ascii="Times New Roman" w:hAnsi="Times New Roman" w:cs="Times New Roman"/>
+                <w:sz w:val="20"/>
+              </w:rPr>
+              <w:t xml:space="preserve">${lp_uraian_4}</w:t>
             </w:r>
           </w:p>
         </w:tc>
       </w:tr>
     </w:tbl>
+    <w:p>
+      <w:pPr>
+        <w:spacing w:after="0" w:line="240" w:lineRule="auto"/>
+        <w:jc w:val="left"/>
+        <w:rPr>
+          <w:rFonts w:ascii="Times New Roman" w:hAnsi="Times New Roman" w:cs="Times New Roman"/>
+        </w:rPr>
+      </w:pPr>
+      <w:r>
+        <w:rPr>
+          <w:rFonts w:ascii="Times New Roman" w:hAnsi="Times New Roman" w:cs="Times New Roman"/>
+        </w:rPr>
+        <w:t xml:space="preserve">${/blok_lampiran}</w:t>
+      </w:r>
+    </w:p>
     <w:p>
       <w:pPr>
         <w:tabs>

</xml_diff>